<commit_message>
Initial commit: ResumeForge AI bot
</commit_message>
<xml_diff>
--- a/resume.docx
+++ b/resume.docx
@@ -22,87 +22,9 @@
     </w:p>
     <w:p>
       <w:r>
-        <w:t>Ім'я Прізвище</w:t>
+        <w:t xml:space="preserve">**John Doe**  </w:t>
         <w:br/>
-        <w:t>Телефон: +380 XX XXX XXXX | Email: example@email.com | LinkedIn: linkedin.com/in/example | GitHub: github.com/example</w:t>
-      </w:r>
-    </w:p>
-    <w:p>
-      <w:r>
-        <w:t>Про себе</w:t>
-        <w:br/>
-        <w:t>--------</w:t>
-        <w:br/>
-        <w:t>Молодий Python розробник зі знанням Django, зацікавлений у проходженні стажування для розвитку практичних навичок у веб-розробці. Самоучка з високою мотивацією, відповідальністю та готовністю швидко навчатися та впроваджувати нові технології. Маю практичний досвід розробки простих веб-додатків під час самонавчання.</w:t>
-      </w:r>
-    </w:p>
-    <w:p>
-      <w:r>
-        <w:t>Досвід роботи</w:t>
-        <w:br/>
-        <w:t>-------------</w:t>
-        <w:br/>
-        <w:t>Немає офіційного досвіду роботи. Активно працював над особистими проектами з використанням Python та Django для створення функціональних веб-додатків.</w:t>
-      </w:r>
-    </w:p>
-    <w:p>
-      <w:r>
-        <w:t>Навички</w:t>
-        <w:br/>
-        <w:t>--------</w:t>
-        <w:br/>
-        <w:t>- Мова програмування: Python</w:t>
-        <w:br/>
-        <w:t>- Веб-фреймворк: Django</w:t>
-        <w:br/>
-        <w:t>- Основи HTML, CSS, JavaScript</w:t>
-        <w:br/>
-        <w:t>- Робота з базами даних: SQLite, базові знання PostgreSQL</w:t>
-        <w:br/>
-        <w:t>- Контроль версій: Git</w:t>
-        <w:br/>
-        <w:t>- Розробка REST API (базові знання)</w:t>
-        <w:br/>
-        <w:t>- Вміння працювати у команді, комунікація</w:t>
-      </w:r>
-    </w:p>
-    <w:p>
-      <w:r>
-        <w:t>Освіта</w:t>
-        <w:br/>
-        <w:t>--------</w:t>
-        <w:br/>
-        <w:t>Самоучка, самостійне вивчення Python та Django (2022 - 2024)</w:t>
-        <w:br/>
-        <w:t>- Пройдено курси: Python Core, Django Web Development, REST API Basics</w:t>
-        <w:br/>
-        <w:t>- Розроблено кілька навчальних проектів (веб-сайт блогу, TODO-аплікація)</w:t>
-      </w:r>
-    </w:p>
-    <w:p>
-      <w:r>
-        <w:t>Досягнення</w:t>
-        <w:br/>
-        <w:t>-----------</w:t>
-        <w:br/>
-        <w:t>- Реалізовано власний блог на Django з можливістю додавання, редагування та видалення постів.</w:t>
-        <w:br/>
-        <w:t>- Розроблено TODO-аплікацію з функцією автентифікації користувачів.</w:t>
-        <w:br/>
-        <w:t>- Оптимізовано структуру бази даних у навчальних проектах для підвищення продуктивності.</w:t>
-      </w:r>
-    </w:p>
-    <w:p>
-      <w:r>
-        <w:t>Додаткова інформація</w:t>
-        <w:br/>
-        <w:t>--------------------</w:t>
-        <w:br/>
-        <w:t>- Англійська мова – середній рівень (Intermediate)</w:t>
-        <w:br/>
-        <w:t>- Відповідальний, швидко навчаюсь, готовий працювати над складними задачами</w:t>
-        <w:br/>
-        <w:t>- Готовий до стажування та подальшого професійного розвитку</w:t>
+        <w:t>Email: john.doe@example.com | Phone: +380 99 123 4567 | LinkedIn: linkedin.com/in/johndoe | Location: Kyiv, Ukraine</w:t>
       </w:r>
     </w:p>
     <w:p>
@@ -112,7 +34,126 @@
     </w:p>
     <w:p>
       <w:r>
-        <w:t>Це резюме оптимізоване для ATS: проста структура, чіткі заголовки, ключові слова (Python, Django, Git, REST API), відсутність графіки чи таблиць, використання цифр для демонстрації досягнень.</w:t>
+        <w:t>### Summary</w:t>
+        <w:br/>
+        <w:t>Detail-oriented Python Developer with 2 years of experience designing, developing, and implementing software solutions. Proficient in Python programming, web frameworks, and data analysis. Adept at problem-solving and working in Agile development teams to deliver high-quality, scalable applications. Strong collaborator with a commitment to continuous learning and improving coding standards.</w:t>
+      </w:r>
+    </w:p>
+    <w:p>
+      <w:r>
+        <w:t>---</w:t>
+      </w:r>
+    </w:p>
+    <w:p>
+      <w:r>
+        <w:t>### Work Experience</w:t>
+      </w:r>
+    </w:p>
+    <w:p>
+      <w:r>
+        <w:t xml:space="preserve">**Python Developer**  </w:t>
+        <w:br/>
+        <w:t xml:space="preserve">Tech Innovators LLC, Kyiv, Ukraine  </w:t>
+        <w:br/>
+        <w:t xml:space="preserve">July 2022 – Present  </w:t>
+        <w:br/>
+        <w:t xml:space="preserve">- Developed and maintained web applications using Python and Django, improving application performance by 20%.  </w:t>
+        <w:br/>
+        <w:t xml:space="preserve">- Collaborated with front-end developers to integrate RESTful APIs, increasing system efficiency and user experience.  </w:t>
+        <w:br/>
+        <w:t xml:space="preserve">- Automated data processing workflows, reducing manual processing time by 30%.  </w:t>
+        <w:br/>
+        <w:t>- Participated in code reviews and implemented best practices for code quality and security.</w:t>
+      </w:r>
+    </w:p>
+    <w:p>
+      <w:r>
+        <w:t xml:space="preserve">**Junior Python Developer**  </w:t>
+        <w:br/>
+        <w:t xml:space="preserve">Soft Solutions, Kyiv, Ukraine  </w:t>
+        <w:br/>
+        <w:t xml:space="preserve">August 2021 – June 2022  </w:t>
+        <w:br/>
+        <w:t xml:space="preserve">- Assisted in building and testing backend components for client projects using Python and Flask framework.  </w:t>
+        <w:br/>
+        <w:t xml:space="preserve">- Developed scripts to automate routine tasks, saving approximately 15 hours of work monthly.  </w:t>
+        <w:br/>
+        <w:t xml:space="preserve">- Wrote unit and integration tests, increasing code coverage by 25%.  </w:t>
+        <w:br/>
+        <w:t>- Worked closely with QA teams to identify and resolve software defects.</w:t>
+      </w:r>
+    </w:p>
+    <w:p>
+      <w:r>
+        <w:t>---</w:t>
+      </w:r>
+    </w:p>
+    <w:p>
+      <w:r>
+        <w:t>### Skills</w:t>
+      </w:r>
+    </w:p>
+    <w:p>
+      <w:r>
+        <w:t xml:space="preserve">- Programming Languages: Python, SQL  </w:t>
+        <w:br/>
+        <w:t xml:space="preserve">- Frameworks: Django, Flask  </w:t>
+        <w:br/>
+        <w:t xml:space="preserve">- Web Technologies: RESTful APIs, HTML, CSS, JavaScript (basic)  </w:t>
+        <w:br/>
+        <w:t xml:space="preserve">- Databases: PostgreSQL, MySQL  </w:t>
+        <w:br/>
+        <w:t xml:space="preserve">- Tools &amp; Platforms: Git, Docker, Linux  </w:t>
+        <w:br/>
+        <w:t xml:space="preserve">- Methodologies: Agile, Scrum  </w:t>
+        <w:br/>
+        <w:t>- Additional: Data analysis with Pandas and NumPy, Unit testing (pytest)</w:t>
+      </w:r>
+    </w:p>
+    <w:p>
+      <w:r>
+        <w:t>---</w:t>
+      </w:r>
+    </w:p>
+    <w:p>
+      <w:r>
+        <w:t>### Education</w:t>
+      </w:r>
+    </w:p>
+    <w:p>
+      <w:r>
+        <w:t xml:space="preserve">**Bachelor of Computer Science**  </w:t>
+        <w:br/>
+        <w:t xml:space="preserve">Taras Shevchenko National University of Kyiv, Ukraine  </w:t>
+        <w:br/>
+        <w:t>Graduated: 2021</w:t>
+      </w:r>
+    </w:p>
+    <w:p>
+      <w:r>
+        <w:t>---</w:t>
+      </w:r>
+    </w:p>
+    <w:p>
+      <w:r>
+        <w:t>### Certifications</w:t>
+      </w:r>
+    </w:p>
+    <w:p>
+      <w:r>
+        <w:t xml:space="preserve">- Python for Everybody (Coursera) – Completed 2021  </w:t>
+        <w:br/>
+        <w:t>- Django for Web Development (Udemy) – Completed 2022</w:t>
+      </w:r>
+    </w:p>
+    <w:p>
+      <w:r>
+        <w:t>---</w:t>
+      </w:r>
+    </w:p>
+    <w:p>
+      <w:r>
+        <w:t>**Languages:** English (Intermediate), Ukrainian (Native), Russian (Fluent)</w:t>
       </w:r>
     </w:p>
     <w:sectPr>

</xml_diff>